<commit_message>
Reescribir en oraciones cortas el párrafo de la Conclusión sobre la solicitud de chofer y las alternativas
El párrafo anterior (una oración de 118 palabras) queda tachado en rojo; se inserta en rojo subrayado la versión reescrita en dos párrafos con oraciones breves, conservando el análisis clase por clase, el fundamento médico para la clase 2421, la brigada de tractores y las funciones administrativas.

Co-Authored-By: Claude Fable 5.1 <noreply@anthropic.com>

Claude-Session: https://claude.ai/code/session_015XTf7YVNkr8YeGhk2dDMDw
</commit_message>
<xml_diff>
--- a/REV4. Informe de Vista Informal Luis Vélez.docx
+++ b/REV4. Informe de Vista Informal Luis Vélez.docx
@@ -6693,6 +6693,7 @@
           <w:rFonts w:ascii="Times New Roman" w:hAnsi="Times New Roman" w:cs="Times New Roman"/>
           <w:lang w:val="es-ES"/>
           <w:color w:val="FF0000"/>
+          <w:strike/>
         </w:rPr>
         <w:t xml:space="preserve">En la vista, el empleado solicitó como acomodo que se le asignara conducir un vehículo de motor (chofer). Sin embargo, dicha función no forma parte de las funciones esenciales de la especificación de clase del puesto de Trabajador, y el empleado no cualifica para las clases de puesto de conducción y operación de equipo consideradas por el Municipio: carece de la licencia de Chofer (categoría 4) que exige la clase Conductor(a) de Vehículos Livianos de Motor, que corresponde a transportar pasajeros en asuntos oficiales, y de la licencia de conducir vehículos pesados de motor que exigen las clases Conductor(a) de Vehículos Pesados de Motor, que corresponde a transportar trabajadores al área de trabajo, y Operador(a) de Equipo Pesado, pues posee únicamente licencia de conductor (categoría 3), sin que la “Operator Certification” que presentó en la vista supla dicho requisito. </w:t>
       </w:r>
@@ -6710,17 +6711,9 @@
           <w:rFonts w:ascii="Times New Roman" w:hAnsi="Times New Roman" w:cs="Times New Roman"/>
           <w:lang w:val="es-ES"/>
           <w:color w:val="FF0000"/>
-          <w:u w:val="single"/>
+          <w:strike/>
         </w:rPr>
         <w:t xml:space="preserve">La función de transportar pasajeros o compañeros de trabajo corresponde a la clase Conductor(a) de Vehículos Livianos de Motor y exige licencia de Chofer (categoría 4).</w:t>
-      </w:r>
-      <w:r>
-        <w:rPr>
-          <w:rFonts w:ascii="Times New Roman" w:hAnsi="Times New Roman" w:cs="Times New Roman"/>
-          <w:lang w:val="es-ES"/>
-          <w:color w:val="FF0000"/>
-        </w:rPr>
-        <w:t xml:space="preserve"> Por tanto, el Municipio está impedido en derecho de conceder dicha solicitud. Las demás alternativas planteadas por el empleado tampoco resultan viables, ya que aunque el empleado cumple con los requisitos de licencia y experiencia de la clase Operador(a) de Equipo Liviano, las funciones esenciales de esa clase requieren esfuerzo físico fuerte y trabajos de limpieza y acondicionamiento de calles y terrenos que sus limitaciones médicas no le permiten realizar; la operación del tractor para cortar grama es esporádica y no constituye trabajo disponible diariamente, por haberse privatizado el mantenimiento de los parques; la operación de un “rolo” requiere licencia de conducir vehículos pesados de motor de la que el empleado carece; </w:t>
       </w:r>
       <w:r>
         <w:rPr>
@@ -6729,8 +6722,71 @@
           <w:color w:val="FF0000"/>
           <w:strike/>
         </w:rPr>
+        <w:t xml:space="preserve"> Por tanto, el Municipio está impedido en derecho de conceder dicha solicitud. Las demás alternativas planteadas por el empleado tampoco resultan viables, ya que aunque el empleado cumple con los requisitos de licencia y experiencia de la clase Operador(a) de Equipo Liviano, las funciones esenciales de esa clase requieren esfuerzo físico fuerte y trabajos de limpieza y acondicionamiento de calles y terrenos que sus limitaciones médicas no le permiten realizar; la operación del tractor para cortar grama es esporádica y no constituye trabajo disponible diariamente, por haberse privatizado el mantenimiento de los parques; la operación de un “rolo” requiere licencia de conducir vehículos pesados de motor de la que el empleado carece; </w:t>
+      </w:r>
+      <w:r>
+        <w:rPr>
+          <w:rFonts w:ascii="Times New Roman" w:hAnsi="Times New Roman" w:cs="Times New Roman"/>
+          <w:lang w:val="es-ES"/>
+          <w:color w:val="FF0000"/>
+          <w:strike/>
+        </w:rPr>
         <w:t xml:space="preserve">y las funciones administrativas que el Médico Ocupacional mencionó</w:t>
       </w:r>
+      <w:r>
+        <w:rPr>
+          <w:rFonts w:ascii="Times New Roman" w:hAnsi="Times New Roman" w:cs="Times New Roman"/>
+          <w:lang w:val="es-ES"/>
+          <w:color w:val="FF0000"/>
+          <w:strike/>
+        </w:rPr>
+        <w:t xml:space="preserve">su integración a la brigada de tractores no constituye un puesto vacante y desplazaría a otro empleado, lo que el propio compareciente indicó no interesar; y las funciones administrativas que el Médico Ocupacional mencionó</w:t>
+      </w:r>
+      <w:r>
+        <w:rPr>
+          <w:rFonts w:ascii="Times New Roman" w:hAnsi="Times New Roman" w:cs="Times New Roman"/>
+          <w:lang w:val="es-ES"/>
+          <w:color w:val="FF0000"/>
+          <w:strike/>
+        </w:rPr>
+        <w:t xml:space="preserve"> “if possible” presuponen la existencia de un puesto vacante compatible con sus limitaciones para el cual el empleado cualifique conforme a su preparación académica y experiencia, el cual no existe al presente.</w:t>
+      </w:r>
+    </w:p>
+    <w:p>
+      <w:pPr>
+        <w:contextualSpacing/>
+        <w:jc w:val="both"/>
+        <w:rPr>
+          <w:rFonts w:ascii="Times New Roman" w:hAnsi="Times New Roman" w:cs="Times New Roman"/>
+          <w:lang w:val="es-ES"/>
+        </w:rPr>
+      </w:pPr>
+      <w:proofErr w:type="spellStart"/>
+      <w:proofErr w:type="spellEnd"/>
+      <w:proofErr w:type="spellStart"/>
+      <w:proofErr w:type="spellEnd"/>
+      <w:proofErr w:type="spellStart"/>
+      <w:proofErr w:type="spellEnd"/>
+      <w:proofErr w:type="spellStart"/>
+      <w:proofErr w:type="spellEnd"/>
+    </w:p>
+    <w:p>
+      <w:pPr>
+        <w:contextualSpacing/>
+        <w:jc w:val="both"/>
+        <w:rPr>
+          <w:rFonts w:ascii="Times New Roman" w:hAnsi="Times New Roman" w:cs="Times New Roman"/>
+          <w:lang w:val="es-ES"/>
+        </w:rPr>
+      </w:pPr>
+      <w:proofErr w:type="spellStart"/>
+      <w:proofErr w:type="spellEnd"/>
+      <w:proofErr w:type="spellStart"/>
+      <w:proofErr w:type="spellEnd"/>
+      <w:proofErr w:type="spellStart"/>
+      <w:proofErr w:type="spellEnd"/>
+      <w:proofErr w:type="spellStart"/>
+      <w:proofErr w:type="spellEnd"/>
       <w:r>
         <w:rPr>
           <w:rFonts w:ascii="Times New Roman" w:hAnsi="Times New Roman" w:cs="Times New Roman"/>
@@ -6738,15 +6794,52 @@
           <w:color w:val="FF0000"/>
           <w:u w:val="single"/>
         </w:rPr>
-        <w:t xml:space="preserve">su integración a la brigada de tractores no constituye un puesto vacante y desplazaría a otro empleado, lo que el propio compareciente indicó no interesar; y las funciones administrativas que el Médico Ocupacional mencionó</w:t>
-      </w:r>
+        <w:t xml:space="preserve">En la vista, el empleado solicitó como acomodo que se le asignara conducir un vehículo de motor como chofer. Esa función no forma parte de las funciones esenciales de la clase de Trabajador. Tampoco cualifica el empleado para las clases de conducción y operación de equipo que consideró el Municipio. Transportar pasajeros en asuntos oficiales corresponde a la clase Conductor(a) de Vehículos Livianos de Motor, que exige licencia de Chofer (categoría 4). Transportar trabajadores al área de trabajo corresponde a la clase Conductor(a) de Vehículos Pesados de Motor, que exige licencia de conducir vehículos pesados. La clase Operador(a) de Equipo Pesado exige esa misma licencia. El empleado posee únicamente licencia de conductor (categoría 3). La “Operator Certification” que presentó en la vista no suple ese requisito. Por tanto, el Municipio está impedido en derecho de conceder la solicitud.</w:t>
+      </w:r>
+    </w:p>
+    <w:p>
+      <w:pPr>
+        <w:contextualSpacing/>
+        <w:jc w:val="both"/>
+        <w:rPr>
+          <w:rFonts w:ascii="Times New Roman" w:hAnsi="Times New Roman" w:cs="Times New Roman"/>
+          <w:lang w:val="es-ES"/>
+        </w:rPr>
+      </w:pPr>
+      <w:proofErr w:type="spellStart"/>
+      <w:proofErr w:type="spellEnd"/>
+      <w:proofErr w:type="spellStart"/>
+      <w:proofErr w:type="spellEnd"/>
+      <w:proofErr w:type="spellStart"/>
+      <w:proofErr w:type="spellEnd"/>
+      <w:proofErr w:type="spellStart"/>
+      <w:proofErr w:type="spellEnd"/>
+    </w:p>
+    <w:p>
+      <w:pPr>
+        <w:contextualSpacing/>
+        <w:jc w:val="both"/>
+        <w:rPr>
+          <w:rFonts w:ascii="Times New Roman" w:hAnsi="Times New Roman" w:cs="Times New Roman"/>
+          <w:lang w:val="es-ES"/>
+        </w:rPr>
+      </w:pPr>
+      <w:proofErr w:type="spellStart"/>
+      <w:proofErr w:type="spellEnd"/>
+      <w:proofErr w:type="spellStart"/>
+      <w:proofErr w:type="spellEnd"/>
+      <w:proofErr w:type="spellStart"/>
+      <w:proofErr w:type="spellEnd"/>
+      <w:proofErr w:type="spellStart"/>
+      <w:proofErr w:type="spellEnd"/>
       <w:r>
         <w:rPr>
           <w:rFonts w:ascii="Times New Roman" w:hAnsi="Times New Roman" w:cs="Times New Roman"/>
           <w:lang w:val="es-ES"/>
           <w:color w:val="FF0000"/>
-        </w:rPr>
-        <w:t xml:space="preserve"> “if possible” presuponen la existencia de un puesto vacante compatible con sus limitaciones para el cual el empleado cualifique conforme a su preparación académica y experiencia, el cual no existe al presente.</w:t>
+          <w:u w:val="single"/>
+        </w:rPr>
+        <w:t xml:space="preserve">Las demás alternativas que planteó el empleado tampoco son viables. El empleado cumple con los requisitos de licencia y experiencia de la clase Operador(a) de Equipo Liviano. Sin embargo, esa clase exige esfuerzo físico fuerte y trabajos de limpieza y acondicionamiento de calles y terrenos. Sus limitaciones médicas no le permiten realizar esas tareas. La operación del tractor para cortar grama es esporádica y no constituye trabajo disponible a diario, porque el mantenimiento de los parques fue privatizado. La operación de un “rolo” requiere licencia de conducir vehículos pesados, que el empleado no posee. Integrarse a la brigada de tractores no constituye un puesto vacante y desplazaría a otro empleado, lo que el propio compareciente indicó no interesar. Las funciones administrativas que el Médico Ocupacional mencionó “if possible” presuponen un puesto vacante compatible con sus limitaciones, para el cual el empleado cualifique por preparación académica y experiencia. Ese puesto no existe al presente.</w:t>
       </w:r>
     </w:p>
     <w:p>

</xml_diff>

<commit_message>
Añadir base legal de las categorías de licencia (Art. 3.03 Ley 22-2000; Reglamento 9169 DTOP) al Derecho Aplicable
Inserción en rojo subrayado al final del Derecho Aplicable: Art. 3.03 Ley 22-2000 (9 LPRA 5053) y delegación al DTOP; Reglamento 9169 y Manual del Conductor; correspondencia de categorías 3, 4, 6-8 y 9 con tipo y peso del vehículo. Pendiente de verificar número/fecha del reglamento y correspondencia categoría-tipo.

Co-Authored-By: Claude Opus 4.8 <noreply@anthropic.com>

Claude-Session: https://claude.ai/code/session_015XTf7YVNkr8YeGhk2dDMDw
</commit_message>
<xml_diff>
--- a/REV4. Informe de Vista Informal Luis Vélez.docx
+++ b/REV4. Informe de Vista Informal Luis Vélez.docx
@@ -6096,6 +6096,69 @@
           <w:rFonts w:ascii="Times New Roman" w:hAnsi="Times New Roman" w:cs="Times New Roman"/>
         </w:rPr>
       </w:pPr>
+    </w:p>
+    <w:p>
+      <w:pPr>
+        <w:contextualSpacing/>
+        <w:jc w:val="both"/>
+        <w:rPr>
+          <w:rFonts w:ascii="Times New Roman" w:hAnsi="Times New Roman" w:cs="Times New Roman"/>
+          <w:b/>
+          <w:bCs/>
+          <w:lang w:val="es-ES"/>
+        </w:rPr>
+      </w:pPr>
+      <w:proofErr w:type="spellStart"/>
+      <w:proofErr w:type="spellEnd"/>
+      <w:proofErr w:type="spellStart"/>
+      <w:proofErr w:type="spellEnd"/>
+      <w:proofErr w:type="spellStart"/>
+      <w:proofErr w:type="spellEnd"/>
+      <w:proofErr w:type="spellStart"/>
+      <w:proofErr w:type="spellEnd"/>
+      <w:proofErr w:type="spellStart"/>
+      <w:proofErr w:type="spellEnd"/>
+    </w:p>
+    <w:p>
+      <w:pPr>
+        <w:contextualSpacing/>
+        <w:jc w:val="both"/>
+        <w:rPr>
+          <w:rFonts w:ascii="Times New Roman" w:hAnsi="Times New Roman" w:cs="Times New Roman"/>
+          <w:b/>
+          <w:bCs/>
+          <w:lang w:val="es-ES"/>
+        </w:rPr>
+      </w:pPr>
+      <w:proofErr w:type="spellStart"/>
+      <w:proofErr w:type="spellEnd"/>
+      <w:proofErr w:type="spellStart"/>
+      <w:proofErr w:type="spellEnd"/>
+      <w:proofErr w:type="spellStart"/>
+      <w:proofErr w:type="spellEnd"/>
+      <w:proofErr w:type="spellStart"/>
+      <w:proofErr w:type="spellEnd"/>
+      <w:proofErr w:type="spellStart"/>
+      <w:proofErr w:type="spellEnd"/>
+      <w:r>
+        <w:rPr>
+          <w:rFonts w:ascii="Times New Roman" w:hAnsi="Times New Roman" w:cs="Times New Roman"/>
+          <w:lang w:val="es-ES"/>
+          <w:color w:val="FF0000"/>
+          <w:u w:val="single"/>
+          <w:b/>
+        </w:rPr>
+        <w:t xml:space="preserve">Marco legal de las licencias de conducir. </w:t>
+      </w:r>
+      <w:r>
+        <w:rPr>
+          <w:rFonts w:ascii="Times New Roman" w:hAnsi="Times New Roman" w:cs="Times New Roman"/>
+          <w:lang w:val="es-ES"/>
+          <w:color w:val="FF0000"/>
+          <w:u w:val="single"/>
+        </w:rPr>
+        <w:t xml:space="preserve">El Artículo 3.03 de la Ley Núm. 22-2000, conocida como “Ley de Vehículos y Tránsito de Puerto Rico” (9 L.P.R.A. § 5053), clasifica los certificados de licencia de conducir y faculta al Departamento de Transportación y Obras Públicas (DTOP) a fijar por reglamento los requisitos y las categorías de cada clase. En virtud de esa facultad, el DTOP adoptó el Reglamento Núm. 9169, y el Manual del Conductor del DTOP tabula las categorías vigentes. Conforme a dicha reglamentación, la categoría 3 (Conductor) autoriza la conducción de vehículos privados o comerciales privados con peso bruto de hasta 10,001 libras; la categoría 4 (Chofer) autoriza la conducción de vehículos dedicados al transporte de pasajeros, bienes o carga mediante paga; las categorías 6, 7 y 8 corresponden a los vehículos pesados de motor Tipo I (hasta 7.5 toneladas), Tipo II (hasta 13 toneladas) y Tipo III (más de 13 toneladas), respectivamente; y la categoría 9 corresponde a los tractores o remolcadores, con o sin arrastre o semiarrastre. La categoría de licencia requerida depende, por tanto, del tipo y del peso del vehículo o equipo, conforme a la Ley 22-2000 y a la reglamentación del DTOP. Las especificaciones de clase de los puestos evaluados por el Municipio remiten a esta reglamentación para determinar la licencia exigida en cada caso.</w:t>
+      </w:r>
     </w:p>
     <w:p>
       <w:pPr>

</xml_diff>